<commit_message>
Windows readiness: static checker (HOOK-06), Windows MCP entry, psql/aws lookup on Windows, LF-delimited MCP stdio
- supporting-files/check_windows_readiness.py: twins with BOM/CRLF + launchers, balanced .ps1 syntax,
  references resolve, no drift between hand-written twins and their .sh, generators and Windows agents
  in sync, mcp.json Windows variants, UTF-8 test guards; wired into the hook tests as HOOK-06
- .kiro/settings/mcp.json: sqlmigration-kit-windows (python -X utf8)
- migkit.platform_compat.find_executable: psql.exe / aws.exe under Program Files; used by schema_tool
- kit_mcp_server: UTF-8, LF-delimited messages on every platform
- README, supporting-files README, quick reference, deck, architecture, migration log updated
- Full run on Aurora PostgreSQL 17.7: 694 checks, RESULT: PASS (run 6e888b8a)

Co-Authored-By: Claude Fable 5.1 <noreply@anthropic.com>
</commit_message>
<xml_diff>
--- a/docs/SQLMigrationProject_Quick_Reference.docx
+++ b/docs/SQLMigrationProject_Quick_Reference.docx
@@ -3578,6 +3578,71 @@
                       <w:sz w:val="13"/>
                       <w:szCs w:val="13"/>
                     </w:rPr>
+                    <w:t xml:space="preserve">python3 supporting-files/check_windows_readiness.py</w:t>
+                  </w:r>
+                </w:p>
+              </w:tc>
+              <w:tc>
+                <w:tcPr>
+                  <w:tcW w:type="dxa" w:w="2482"/>
+                  <w:tcBorders>
+                    <w:top w:val="single" w:color="C9D5D8" w:sz="2"/>
+                    <w:left w:val="single" w:color="C9D5D8" w:sz="2"/>
+                    <w:bottom w:val="single" w:color="C9D5D8" w:sz="2"/>
+                    <w:right w:val="single" w:color="C9D5D8" w:sz="2"/>
+                  </w:tcBorders>
+                  <w:tcMar>
+                    <w:top w:type="dxa" w:w="8"/>
+                    <w:left w:type="dxa" w:w="46"/>
+                    <w:bottom w:type="dxa" w:w="8"/>
+                    <w:right w:type="dxa" w:w="36"/>
+                  </w:tcMar>
+                  <w:vAlign w:val="center"/>
+                </w:tcPr>
+                <w:p>
+                  <w:pPr>
+                    <w:spacing w:after="0" w:before="0" w:line="212"/>
+                  </w:pPr>
+                  <w:r>
+                    <w:rPr>
+                      <w:rFonts w:ascii="Calibri" w:cs="Calibri" w:eastAsia="Calibri" w:hAnsi="Calibri"/>
+                      <w:sz w:val="14"/>
+                      <w:szCs w:val="14"/>
+                    </w:rPr>
+                    <w:t xml:space="preserve">static Windows readiness check (HOOK-06): twins, launchers, syntax, drift, mcp.json</w:t>
+                  </w:r>
+                </w:p>
+              </w:tc>
+            </w:tr>
+            <w:tr>
+              <w:tc>
+                <w:tcPr>
+                  <w:tcW w:type="dxa" w:w="2689"/>
+                  <w:tcBorders>
+                    <w:top w:val="single" w:color="C9D5D8" w:sz="2"/>
+                    <w:left w:val="single" w:color="C9D5D8" w:sz="2"/>
+                    <w:bottom w:val="single" w:color="C9D5D8" w:sz="2"/>
+                    <w:right w:val="single" w:color="C9D5D8" w:sz="2"/>
+                  </w:tcBorders>
+                  <w:tcMar>
+                    <w:top w:type="dxa" w:w="8"/>
+                    <w:left w:type="dxa" w:w="46"/>
+                    <w:bottom w:type="dxa" w:w="8"/>
+                    <w:right w:type="dxa" w:w="36"/>
+                  </w:tcMar>
+                  <w:vAlign w:val="center"/>
+                </w:tcPr>
+                <w:p>
+                  <w:pPr>
+                    <w:spacing w:after="0" w:before="0" w:line="212"/>
+                  </w:pPr>
+                  <w:r>
+                    <w:rPr>
+                      <w:rFonts w:ascii="Consolas" w:cs="Consolas" w:eastAsia="Consolas" w:hAnsi="Consolas"/>
+                      <w:color w:val="1F1F1F"/>
+                      <w:sz w:val="13"/>
+                      <w:szCs w:val="13"/>
+                    </w:rPr>
                     <w:t xml:space="preserve">bash supporting-files/verify_agents.sh [--smoke]</w:t>
                   </w:r>
                 </w:p>
@@ -5457,7 +5522,7 @@
                 <w:sz w:val="18"/>
                 <w:szCs w:val="18"/>
               </w:rPr>
-              <w:t xml:space="preserve">Tests — 693 checks, all passing</w:t>
+              <w:t xml:space="preserve">Tests — 694 checks, all passing</w:t>
             </w:r>
           </w:p>
           <w:tbl>
@@ -5761,7 +5826,7 @@
                       <w:sz w:val="14"/>
                       <w:szCs w:val="14"/>
                     </w:rPr>
-                    <w:t xml:space="preserve">Agent hooks · agents · kit MCP server</w:t>
+                    <w:t xml:space="preserve">Agent hooks (incl. Windows readiness) · agents · kit MCP server</w:t>
                   </w:r>
                 </w:p>
               </w:tc>
@@ -5792,7 +5857,7 @@
                       <w:sz w:val="14"/>
                       <w:szCs w:val="14"/>
                     </w:rPr>
-                    <w:t xml:space="preserve">18 · 8 · 4</w:t>
+                    <w:t xml:space="preserve">19 · 8 · 4</w:t>
                   </w:r>
                 </w:p>
               </w:tc>

</xml_diff>

<commit_message>
Technical architecture and quick reference brought up to date (skill map figure, two agents, MCP, Windows readiness, evidence on Redshift/Athena)
Co-Authored-By: Claude Fable 5.1 <noreply@anthropic.com>
</commit_message>
<xml_diff>
--- a/docs/SQLMigrationProject_Quick_Reference.docx
+++ b/docs/SQLMigrationProject_Quick_Reference.docx
@@ -1071,6 +1071,793 @@
                 <w:sz w:val="18"/>
                 <w:szCs w:val="18"/>
               </w:rPr>
+              <w:t xml:space="preserve">Skill map — group × target (governance.md)</w:t>
+            </w:r>
+          </w:p>
+          <w:tbl>
+            <w:tblPr>
+              <w:tblW w:type="dxa" w:w="5170"/>
+              <w:tblBorders>
+                <w:top w:val="single" w:color="auto" w:sz="4"/>
+                <w:left w:val="single" w:color="auto" w:sz="4"/>
+                <w:bottom w:val="single" w:color="auto" w:sz="4"/>
+                <w:right w:val="single" w:color="auto" w:sz="4"/>
+                <w:insideH w:val="single" w:color="auto" w:sz="4"/>
+                <w:insideV w:val="single" w:color="auto" w:sz="4"/>
+              </w:tblBorders>
+              <w:tblLayout w:type="fixed"/>
+            </w:tblPr>
+            <w:tblGrid>
+              <w:gridCol w:w="1034"/>
+              <w:gridCol w:w="1396"/>
+              <w:gridCol w:w="1396"/>
+              <w:gridCol w:w="1344"/>
+            </w:tblGrid>
+            <w:tr>
+              <w:tc>
+                <w:tcPr>
+                  <w:tcW w:type="dxa" w:w="1034"/>
+                  <w:tcBorders>
+                    <w:top w:val="single" w:color="C9D5D8" w:sz="2"/>
+                    <w:left w:val="single" w:color="C9D5D8" w:sz="2"/>
+                    <w:bottom w:val="single" w:color="C9D5D8" w:sz="2"/>
+                    <w:right w:val="single" w:color="C9D5D8" w:sz="2"/>
+                  </w:tcBorders>
+                  <w:shd w:fill="DCEBEE" w:color="auto" w:val="clear"/>
+                  <w:tcMar>
+                    <w:top w:type="dxa" w:w="8"/>
+                    <w:left w:type="dxa" w:w="46"/>
+                    <w:bottom w:type="dxa" w:w="8"/>
+                    <w:right w:type="dxa" w:w="36"/>
+                  </w:tcMar>
+                  <w:vAlign w:val="center"/>
+                </w:tcPr>
+                <w:p>
+                  <w:pPr>
+                    <w:spacing w:after="0" w:before="0" w:line="212"/>
+                  </w:pPr>
+                  <w:r>
+                    <w:rPr>
+                      <w:rFonts w:ascii="Calibri" w:cs="Calibri" w:eastAsia="Calibri" w:hAnsi="Calibri"/>
+                      <w:b/>
+                      <w:bCs/>
+                      <w:color w:val="0B2E3A"/>
+                      <w:sz w:val="14"/>
+                      <w:szCs w:val="14"/>
+                    </w:rPr>
+                    <w:t xml:space="preserve">Target</w:t>
+                  </w:r>
+                </w:p>
+              </w:tc>
+              <w:tc>
+                <w:tcPr>
+                  <w:tcW w:type="dxa" w:w="1396"/>
+                  <w:tcBorders>
+                    <w:top w:val="single" w:color="C9D5D8" w:sz="2"/>
+                    <w:left w:val="single" w:color="C9D5D8" w:sz="2"/>
+                    <w:bottom w:val="single" w:color="C9D5D8" w:sz="2"/>
+                    <w:right w:val="single" w:color="C9D5D8" w:sz="2"/>
+                  </w:tcBorders>
+                  <w:shd w:fill="DCEBEE" w:color="auto" w:val="clear"/>
+                  <w:tcMar>
+                    <w:top w:type="dxa" w:w="8"/>
+                    <w:left w:type="dxa" w:w="46"/>
+                    <w:bottom w:type="dxa" w:w="8"/>
+                    <w:right w:type="dxa" w:w="36"/>
+                  </w:tcMar>
+                  <w:vAlign w:val="center"/>
+                </w:tcPr>
+                <w:p>
+                  <w:pPr>
+                    <w:spacing w:after="0" w:before="0" w:line="212"/>
+                  </w:pPr>
+                  <w:r>
+                    <w:rPr>
+                      <w:rFonts w:ascii="Calibri" w:cs="Calibri" w:eastAsia="Calibri" w:hAnsi="Calibri"/>
+                      <w:b/>
+                      <w:bCs/>
+                      <w:color w:val="0B2E3A"/>
+                      <w:sz w:val="14"/>
+                      <w:szCs w:val="14"/>
+                    </w:rPr>
+                    <w:t xml:space="preserve">Standalone SQL objects</w:t>
+                  </w:r>
+                </w:p>
+              </w:tc>
+              <w:tc>
+                <w:tcPr>
+                  <w:tcW w:type="dxa" w:w="1396"/>
+                  <w:tcBorders>
+                    <w:top w:val="single" w:color="C9D5D8" w:sz="2"/>
+                    <w:left w:val="single" w:color="C9D5D8" w:sz="2"/>
+                    <w:bottom w:val="single" w:color="C9D5D8" w:sz="2"/>
+                    <w:right w:val="single" w:color="C9D5D8" w:sz="2"/>
+                  </w:tcBorders>
+                  <w:shd w:fill="DCEBEE" w:color="auto" w:val="clear"/>
+                  <w:tcMar>
+                    <w:top w:type="dxa" w:w="8"/>
+                    <w:left w:type="dxa" w:w="46"/>
+                    <w:bottom w:type="dxa" w:w="8"/>
+                    <w:right w:type="dxa" w:w="36"/>
+                  </w:tcMar>
+                  <w:vAlign w:val="center"/>
+                </w:tcPr>
+                <w:p>
+                  <w:pPr>
+                    <w:spacing w:after="0" w:before="0" w:line="212"/>
+                  </w:pPr>
+                  <w:r>
+                    <w:rPr>
+                      <w:rFonts w:ascii="Calibri" w:cs="Calibri" w:eastAsia="Calibri" w:hAnsi="Calibri"/>
+                      <w:b/>
+                      <w:bCs/>
+                      <w:color w:val="0B2E3A"/>
+                      <w:sz w:val="14"/>
+                      <w:szCs w:val="14"/>
+                    </w:rPr>
+                    <w:t xml:space="preserve">SQL in Informatica ETL</w:t>
+                  </w:r>
+                </w:p>
+              </w:tc>
+              <w:tc>
+                <w:tcPr>
+                  <w:tcW w:type="dxa" w:w="1344"/>
+                  <w:tcBorders>
+                    <w:top w:val="single" w:color="C9D5D8" w:sz="2"/>
+                    <w:left w:val="single" w:color="C9D5D8" w:sz="2"/>
+                    <w:bottom w:val="single" w:color="C9D5D8" w:sz="2"/>
+                    <w:right w:val="single" w:color="C9D5D8" w:sz="2"/>
+                  </w:tcBorders>
+                  <w:shd w:fill="DCEBEE" w:color="auto" w:val="clear"/>
+                  <w:tcMar>
+                    <w:top w:type="dxa" w:w="8"/>
+                    <w:left w:type="dxa" w:w="46"/>
+                    <w:bottom w:type="dxa" w:w="8"/>
+                    <w:right w:type="dxa" w:w="36"/>
+                  </w:tcMar>
+                  <w:vAlign w:val="center"/>
+                </w:tcPr>
+                <w:p>
+                  <w:pPr>
+                    <w:spacing w:after="0" w:before="0" w:line="212"/>
+                  </w:pPr>
+                  <w:r>
+                    <w:rPr>
+                      <w:rFonts w:ascii="Calibri" w:cs="Calibri" w:eastAsia="Calibri" w:hAnsi="Calibri"/>
+                      <w:b/>
+                      <w:bCs/>
+                      <w:color w:val="0B2E3A"/>
+                      <w:sz w:val="14"/>
+                      <w:szCs w:val="14"/>
+                    </w:rPr>
+                    <w:t xml:space="preserve">Reporting SQL</w:t>
+                  </w:r>
+                </w:p>
+              </w:tc>
+            </w:tr>
+            <w:tr>
+              <w:tc>
+                <w:tcPr>
+                  <w:tcW w:type="dxa" w:w="1034"/>
+                  <w:tcBorders>
+                    <w:top w:val="single" w:color="C9D5D8" w:sz="2"/>
+                    <w:left w:val="single" w:color="C9D5D8" w:sz="2"/>
+                    <w:bottom w:val="single" w:color="C9D5D8" w:sz="2"/>
+                    <w:right w:val="single" w:color="C9D5D8" w:sz="2"/>
+                  </w:tcBorders>
+                  <w:tcMar>
+                    <w:top w:type="dxa" w:w="8"/>
+                    <w:left w:type="dxa" w:w="46"/>
+                    <w:bottom w:type="dxa" w:w="8"/>
+                    <w:right w:type="dxa" w:w="36"/>
+                  </w:tcMar>
+                  <w:vAlign w:val="center"/>
+                </w:tcPr>
+                <w:p>
+                  <w:pPr>
+                    <w:spacing w:after="0" w:before="0" w:line="212"/>
+                  </w:pPr>
+                  <w:r>
+                    <w:rPr>
+                      <w:rFonts w:ascii="Calibri" w:cs="Calibri" w:eastAsia="Calibri" w:hAnsi="Calibri"/>
+                      <w:sz w:val="14"/>
+                      <w:szCs w:val="14"/>
+                    </w:rPr>
+                    <w:t xml:space="preserve">Aurora PostgreSQL</w:t>
+                  </w:r>
+                </w:p>
+              </w:tc>
+              <w:tc>
+                <w:tcPr>
+                  <w:tcW w:type="dxa" w:w="1396"/>
+                  <w:tcBorders>
+                    <w:top w:val="single" w:color="C9D5D8" w:sz="2"/>
+                    <w:left w:val="single" w:color="C9D5D8" w:sz="2"/>
+                    <w:bottom w:val="single" w:color="C9D5D8" w:sz="2"/>
+                    <w:right w:val="single" w:color="C9D5D8" w:sz="2"/>
+                  </w:tcBorders>
+                  <w:tcMar>
+                    <w:top w:type="dxa" w:w="8"/>
+                    <w:left w:type="dxa" w:w="46"/>
+                    <w:bottom w:type="dxa" w:w="8"/>
+                    <w:right w:type="dxa" w:w="36"/>
+                  </w:tcMar>
+                  <w:vAlign w:val="center"/>
+                </w:tcPr>
+                <w:p>
+                  <w:pPr>
+                    <w:spacing w:after="0" w:before="0" w:line="212"/>
+                  </w:pPr>
+                  <w:r>
+                    <w:rPr>
+                      <w:rFonts w:ascii="Consolas" w:cs="Consolas" w:eastAsia="Consolas" w:hAnsi="Consolas"/>
+                      <w:color w:val="1F1F1F"/>
+                      <w:sz w:val="13"/>
+                      <w:szCs w:val="13"/>
+                    </w:rPr>
+                    <w:t xml:space="preserve">sql-conversion</w:t>
+                  </w:r>
+                  <w:r>
+                    <w:rPr>
+                      <w:rFonts w:ascii="Calibri" w:cs="Calibri" w:eastAsia="Calibri" w:hAnsi="Calibri"/>
+                      <w:sz w:val="14"/>
+                      <w:szCs w:val="14"/>
+                    </w:rPr>
+                    <w:t xml:space="preserve"> · migration.md</w:t>
+                  </w:r>
+                </w:p>
+              </w:tc>
+              <w:tc>
+                <w:tcPr>
+                  <w:tcW w:type="dxa" w:w="1396"/>
+                  <w:tcBorders>
+                    <w:top w:val="single" w:color="C9D5D8" w:sz="2"/>
+                    <w:left w:val="single" w:color="C9D5D8" w:sz="2"/>
+                    <w:bottom w:val="single" w:color="C9D5D8" w:sz="2"/>
+                    <w:right w:val="single" w:color="C9D5D8" w:sz="2"/>
+                  </w:tcBorders>
+                  <w:tcMar>
+                    <w:top w:type="dxa" w:w="8"/>
+                    <w:left w:type="dxa" w:w="46"/>
+                    <w:bottom w:type="dxa" w:w="8"/>
+                    <w:right w:type="dxa" w:w="36"/>
+                  </w:tcMar>
+                  <w:vAlign w:val="center"/>
+                </w:tcPr>
+                <w:p>
+                  <w:pPr>
+                    <w:spacing w:after="0" w:before="0" w:line="212"/>
+                  </w:pPr>
+                  <w:r>
+                    <w:rPr>
+                      <w:rFonts w:ascii="Consolas" w:cs="Consolas" w:eastAsia="Consolas" w:hAnsi="Consolas"/>
+                      <w:color w:val="1F1F1F"/>
+                      <w:sz w:val="13"/>
+                      <w:szCs w:val="13"/>
+                    </w:rPr>
+                    <w:t xml:space="preserve">informatica-etl-conversion --target postgres</w:t>
+                  </w:r>
+                </w:p>
+              </w:tc>
+              <w:tc>
+                <w:tcPr>
+                  <w:tcW w:type="dxa" w:w="1344"/>
+                  <w:tcBorders>
+                    <w:top w:val="single" w:color="C9D5D8" w:sz="2"/>
+                    <w:left w:val="single" w:color="C9D5D8" w:sz="2"/>
+                    <w:bottom w:val="single" w:color="C9D5D8" w:sz="2"/>
+                    <w:right w:val="single" w:color="C9D5D8" w:sz="2"/>
+                  </w:tcBorders>
+                  <w:tcMar>
+                    <w:top w:type="dxa" w:w="8"/>
+                    <w:left w:type="dxa" w:w="46"/>
+                    <w:bottom w:type="dxa" w:w="8"/>
+                    <w:right w:type="dxa" w:w="36"/>
+                  </w:tcMar>
+                  <w:vAlign w:val="center"/>
+                </w:tcPr>
+                <w:p>
+                  <w:pPr>
+                    <w:spacing w:after="0" w:before="0" w:line="212"/>
+                  </w:pPr>
+                  <w:r>
+                    <w:rPr>
+                      <w:rFonts w:ascii="Consolas" w:cs="Consolas" w:eastAsia="Consolas" w:hAnsi="Consolas"/>
+                      <w:color w:val="1F1F1F"/>
+                      <w:sz w:val="13"/>
+                      <w:szCs w:val="13"/>
+                    </w:rPr>
+                    <w:t xml:space="preserve">sql-reporting --target postgres</w:t>
+                  </w:r>
+                  <w:r>
+                    <w:rPr>
+                      <w:rFonts w:ascii="Calibri" w:cs="Calibri" w:eastAsia="Calibri" w:hAnsi="Calibri"/>
+                      <w:sz w:val="14"/>
+                      <w:szCs w:val="14"/>
+                    </w:rPr>
+                    <w:t xml:space="preserve"> (executed)</w:t>
+                  </w:r>
+                </w:p>
+              </w:tc>
+            </w:tr>
+            <w:tr>
+              <w:tc>
+                <w:tcPr>
+                  <w:tcW w:type="dxa" w:w="1034"/>
+                  <w:tcBorders>
+                    <w:top w:val="single" w:color="C9D5D8" w:sz="2"/>
+                    <w:left w:val="single" w:color="C9D5D8" w:sz="2"/>
+                    <w:bottom w:val="single" w:color="C9D5D8" w:sz="2"/>
+                    <w:right w:val="single" w:color="C9D5D8" w:sz="2"/>
+                  </w:tcBorders>
+                  <w:tcMar>
+                    <w:top w:type="dxa" w:w="8"/>
+                    <w:left w:type="dxa" w:w="46"/>
+                    <w:bottom w:type="dxa" w:w="8"/>
+                    <w:right w:type="dxa" w:w="36"/>
+                  </w:tcMar>
+                  <w:vAlign w:val="center"/>
+                </w:tcPr>
+                <w:p>
+                  <w:pPr>
+                    <w:spacing w:after="0" w:before="0" w:line="212"/>
+                  </w:pPr>
+                  <w:r>
+                    <w:rPr>
+                      <w:rFonts w:ascii="Calibri" w:cs="Calibri" w:eastAsia="Calibri" w:hAnsi="Calibri"/>
+                      <w:sz w:val="14"/>
+                      <w:szCs w:val="14"/>
+                    </w:rPr>
+                    <w:t xml:space="preserve">Amazon Redshift</w:t>
+                  </w:r>
+                </w:p>
+              </w:tc>
+              <w:tc>
+                <w:tcPr>
+                  <w:tcW w:type="dxa" w:w="1396"/>
+                  <w:tcBorders>
+                    <w:top w:val="single" w:color="C9D5D8" w:sz="2"/>
+                    <w:left w:val="single" w:color="C9D5D8" w:sz="2"/>
+                    <w:bottom w:val="single" w:color="C9D5D8" w:sz="2"/>
+                    <w:right w:val="single" w:color="C9D5D8" w:sz="2"/>
+                  </w:tcBorders>
+                  <w:tcMar>
+                    <w:top w:type="dxa" w:w="8"/>
+                    <w:left w:type="dxa" w:w="46"/>
+                    <w:bottom w:type="dxa" w:w="8"/>
+                    <w:right w:type="dxa" w:w="36"/>
+                  </w:tcMar>
+                  <w:vAlign w:val="center"/>
+                </w:tcPr>
+                <w:p>
+                  <w:pPr>
+                    <w:spacing w:after="0" w:before="0" w:line="212"/>
+                  </w:pPr>
+                  <w:r>
+                    <w:rPr>
+                      <w:rFonts w:ascii="Consolas" w:cs="Consolas" w:eastAsia="Consolas" w:hAnsi="Consolas"/>
+                      <w:color w:val="1F1F1F"/>
+                      <w:sz w:val="13"/>
+                      <w:szCs w:val="13"/>
+                    </w:rPr>
+                    <w:t xml:space="preserve">sql-conversion-redshift</w:t>
+                  </w:r>
+                  <w:r>
+                    <w:rPr>
+                      <w:rFonts w:ascii="Calibri" w:cs="Calibri" w:eastAsia="Calibri" w:hAnsi="Calibri"/>
+                      <w:sz w:val="14"/>
+                      <w:szCs w:val="14"/>
+                    </w:rPr>
+                    <w:t xml:space="preserve"> · redshift.md</w:t>
+                  </w:r>
+                </w:p>
+              </w:tc>
+              <w:tc>
+                <w:tcPr>
+                  <w:tcW w:type="dxa" w:w="1396"/>
+                  <w:tcBorders>
+                    <w:top w:val="single" w:color="C9D5D8" w:sz="2"/>
+                    <w:left w:val="single" w:color="C9D5D8" w:sz="2"/>
+                    <w:bottom w:val="single" w:color="C9D5D8" w:sz="2"/>
+                    <w:right w:val="single" w:color="C9D5D8" w:sz="2"/>
+                  </w:tcBorders>
+                  <w:tcMar>
+                    <w:top w:type="dxa" w:w="8"/>
+                    <w:left w:type="dxa" w:w="46"/>
+                    <w:bottom w:type="dxa" w:w="8"/>
+                    <w:right w:type="dxa" w:w="36"/>
+                  </w:tcMar>
+                  <w:vAlign w:val="center"/>
+                </w:tcPr>
+                <w:p>
+                  <w:pPr>
+                    <w:spacing w:after="0" w:before="0" w:line="212"/>
+                  </w:pPr>
+                  <w:r>
+                    <w:rPr>
+                      <w:rFonts w:ascii="Consolas" w:cs="Consolas" w:eastAsia="Consolas" w:hAnsi="Consolas"/>
+                      <w:color w:val="1F1F1F"/>
+                      <w:sz w:val="13"/>
+                      <w:szCs w:val="13"/>
+                    </w:rPr>
+                    <w:t xml:space="preserve">--target redshift</w:t>
+                  </w:r>
+                  <w:r>
+                    <w:rPr>
+                      <w:rFonts w:ascii="Calibri" w:cs="Calibri" w:eastAsia="Calibri" w:hAnsi="Calibri"/>
+                      <w:sz w:val="14"/>
+                      <w:szCs w:val="14"/>
+                    </w:rPr>
+                    <w:t xml:space="preserve"> · redshift_map.json</w:t>
+                  </w:r>
+                </w:p>
+              </w:tc>
+              <w:tc>
+                <w:tcPr>
+                  <w:tcW w:type="dxa" w:w="1344"/>
+                  <w:tcBorders>
+                    <w:top w:val="single" w:color="C9D5D8" w:sz="2"/>
+                    <w:left w:val="single" w:color="C9D5D8" w:sz="2"/>
+                    <w:bottom w:val="single" w:color="C9D5D8" w:sz="2"/>
+                    <w:right w:val="single" w:color="C9D5D8" w:sz="2"/>
+                  </w:tcBorders>
+                  <w:tcMar>
+                    <w:top w:type="dxa" w:w="8"/>
+                    <w:left w:type="dxa" w:w="46"/>
+                    <w:bottom w:type="dxa" w:w="8"/>
+                    <w:right w:type="dxa" w:w="36"/>
+                  </w:tcMar>
+                  <w:vAlign w:val="center"/>
+                </w:tcPr>
+                <w:p>
+                  <w:pPr>
+                    <w:spacing w:after="0" w:before="0" w:line="212"/>
+                  </w:pPr>
+                  <w:r>
+                    <w:rPr>
+                      <w:rFonts w:ascii="Consolas" w:cs="Consolas" w:eastAsia="Consolas" w:hAnsi="Consolas"/>
+                      <w:color w:val="1F1F1F"/>
+                      <w:sz w:val="13"/>
+                      <w:szCs w:val="13"/>
+                    </w:rPr>
+                    <w:t xml:space="preserve">sql-reporting --target redshift</w:t>
+                  </w:r>
+                </w:p>
+              </w:tc>
+            </w:tr>
+            <w:tr>
+              <w:tc>
+                <w:tcPr>
+                  <w:tcW w:type="dxa" w:w="1034"/>
+                  <w:tcBorders>
+                    <w:top w:val="single" w:color="C9D5D8" w:sz="2"/>
+                    <w:left w:val="single" w:color="C9D5D8" w:sz="2"/>
+                    <w:bottom w:val="single" w:color="C9D5D8" w:sz="2"/>
+                    <w:right w:val="single" w:color="C9D5D8" w:sz="2"/>
+                  </w:tcBorders>
+                  <w:tcMar>
+                    <w:top w:type="dxa" w:w="8"/>
+                    <w:left w:type="dxa" w:w="46"/>
+                    <w:bottom w:type="dxa" w:w="8"/>
+                    <w:right w:type="dxa" w:w="36"/>
+                  </w:tcMar>
+                  <w:vAlign w:val="center"/>
+                </w:tcPr>
+                <w:p>
+                  <w:pPr>
+                    <w:spacing w:after="0" w:before="0" w:line="212"/>
+                  </w:pPr>
+                  <w:r>
+                    <w:rPr>
+                      <w:rFonts w:ascii="Calibri" w:cs="Calibri" w:eastAsia="Calibri" w:hAnsi="Calibri"/>
+                      <w:sz w:val="14"/>
+                      <w:szCs w:val="14"/>
+                    </w:rPr>
+                    <w:t xml:space="preserve">Iceberg on S3</w:t>
+                  </w:r>
+                </w:p>
+              </w:tc>
+              <w:tc>
+                <w:tcPr>
+                  <w:tcW w:type="dxa" w:w="1396"/>
+                  <w:tcBorders>
+                    <w:top w:val="single" w:color="C9D5D8" w:sz="2"/>
+                    <w:left w:val="single" w:color="C9D5D8" w:sz="2"/>
+                    <w:bottom w:val="single" w:color="C9D5D8" w:sz="2"/>
+                    <w:right w:val="single" w:color="C9D5D8" w:sz="2"/>
+                  </w:tcBorders>
+                  <w:tcMar>
+                    <w:top w:type="dxa" w:w="8"/>
+                    <w:left w:type="dxa" w:w="46"/>
+                    <w:bottom w:type="dxa" w:w="8"/>
+                    <w:right w:type="dxa" w:w="36"/>
+                  </w:tcMar>
+                  <w:vAlign w:val="center"/>
+                </w:tcPr>
+                <w:p>
+                  <w:pPr>
+                    <w:spacing w:after="0" w:before="0" w:line="212"/>
+                  </w:pPr>
+                  <w:r>
+                    <w:rPr>
+                      <w:rFonts w:ascii="Consolas" w:cs="Consolas" w:eastAsia="Consolas" w:hAnsi="Consolas"/>
+                      <w:color w:val="1F1F1F"/>
+                      <w:sz w:val="13"/>
+                      <w:szCs w:val="13"/>
+                    </w:rPr>
+                    <w:t xml:space="preserve">sql-conversion-iceberg</w:t>
+                  </w:r>
+                  <w:r>
+                    <w:rPr>
+                      <w:rFonts w:ascii="Calibri" w:cs="Calibri" w:eastAsia="Calibri" w:hAnsi="Calibri"/>
+                      <w:sz w:val="14"/>
+                      <w:szCs w:val="14"/>
+                    </w:rPr>
+                    <w:t xml:space="preserve"> · iceberg.md</w:t>
+                  </w:r>
+                </w:p>
+              </w:tc>
+              <w:tc>
+                <w:tcPr>
+                  <w:tcW w:type="dxa" w:w="1396"/>
+                  <w:tcBorders>
+                    <w:top w:val="single" w:color="C9D5D8" w:sz="2"/>
+                    <w:left w:val="single" w:color="C9D5D8" w:sz="2"/>
+                    <w:bottom w:val="single" w:color="C9D5D8" w:sz="2"/>
+                    <w:right w:val="single" w:color="C9D5D8" w:sz="2"/>
+                  </w:tcBorders>
+                  <w:tcMar>
+                    <w:top w:type="dxa" w:w="8"/>
+                    <w:left w:type="dxa" w:w="46"/>
+                    <w:bottom w:type="dxa" w:w="8"/>
+                    <w:right w:type="dxa" w:w="36"/>
+                  </w:tcMar>
+                  <w:vAlign w:val="center"/>
+                </w:tcPr>
+                <w:p>
+                  <w:pPr>
+                    <w:spacing w:after="0" w:before="0" w:line="212"/>
+                  </w:pPr>
+                  <w:r>
+                    <w:rPr>
+                      <w:rFonts w:ascii="Consolas" w:cs="Consolas" w:eastAsia="Consolas" w:hAnsi="Consolas"/>
+                      <w:color w:val="1F1F1F"/>
+                      <w:sz w:val="13"/>
+                      <w:szCs w:val="13"/>
+                    </w:rPr>
+                    <w:t xml:space="preserve">--target iceberg</w:t>
+                  </w:r>
+                  <w:r>
+                    <w:rPr>
+                      <w:rFonts w:ascii="Calibri" w:cs="Calibri" w:eastAsia="Calibri" w:hAnsi="Calibri"/>
+                      <w:sz w:val="14"/>
+                      <w:szCs w:val="14"/>
+                    </w:rPr>
+                    <w:t xml:space="preserve"> · S3 landing + Glue job</w:t>
+                  </w:r>
+                </w:p>
+              </w:tc>
+              <w:tc>
+                <w:tcPr>
+                  <w:tcW w:type="dxa" w:w="1344"/>
+                  <w:tcBorders>
+                    <w:top w:val="single" w:color="C9D5D8" w:sz="2"/>
+                    <w:left w:val="single" w:color="C9D5D8" w:sz="2"/>
+                    <w:bottom w:val="single" w:color="C9D5D8" w:sz="2"/>
+                    <w:right w:val="single" w:color="C9D5D8" w:sz="2"/>
+                  </w:tcBorders>
+                  <w:tcMar>
+                    <w:top w:type="dxa" w:w="8"/>
+                    <w:left w:type="dxa" w:w="46"/>
+                    <w:bottom w:type="dxa" w:w="8"/>
+                    <w:right w:type="dxa" w:w="36"/>
+                  </w:tcMar>
+                  <w:vAlign w:val="center"/>
+                </w:tcPr>
+                <w:p>
+                  <w:pPr>
+                    <w:spacing w:after="0" w:before="0" w:line="212"/>
+                  </w:pPr>
+                  <w:r>
+                    <w:rPr>
+                      <w:rFonts w:ascii="Consolas" w:cs="Consolas" w:eastAsia="Consolas" w:hAnsi="Consolas"/>
+                      <w:color w:val="1F1F1F"/>
+                      <w:sz w:val="13"/>
+                      <w:szCs w:val="13"/>
+                    </w:rPr>
+                    <w:t xml:space="preserve">--target athena</w:t>
+                  </w:r>
+                  <w:r>
+                    <w:rPr>
+                      <w:rFonts w:ascii="Calibri" w:cs="Calibri" w:eastAsia="Calibri" w:hAnsi="Calibri"/>
+                      <w:sz w:val="14"/>
+                      <w:szCs w:val="14"/>
+                    </w:rPr>
+                    <w:t xml:space="preserve"> / </w:t>
+                  </w:r>
+                  <w:r>
+                    <w:rPr>
+                      <w:rFonts w:ascii="Consolas" w:cs="Consolas" w:eastAsia="Consolas" w:hAnsi="Consolas"/>
+                      <w:color w:val="1F1F1F"/>
+                      <w:sz w:val="13"/>
+                      <w:szCs w:val="13"/>
+                    </w:rPr>
+                    <w:t xml:space="preserve">spark</w:t>
+                  </w:r>
+                </w:p>
+              </w:tc>
+            </w:tr>
+            <w:tr>
+              <w:tc>
+                <w:tcPr>
+                  <w:tcW w:type="dxa" w:w="1034"/>
+                  <w:tcBorders>
+                    <w:top w:val="single" w:color="C9D5D8" w:sz="2"/>
+                    <w:left w:val="single" w:color="C9D5D8" w:sz="2"/>
+                    <w:bottom w:val="single" w:color="C9D5D8" w:sz="2"/>
+                    <w:right w:val="single" w:color="C9D5D8" w:sz="2"/>
+                  </w:tcBorders>
+                  <w:tcMar>
+                    <w:top w:type="dxa" w:w="8"/>
+                    <w:left w:type="dxa" w:w="46"/>
+                    <w:bottom w:type="dxa" w:w="8"/>
+                    <w:right w:type="dxa" w:w="36"/>
+                  </w:tcMar>
+                  <w:vAlign w:val="center"/>
+                </w:tcPr>
+                <w:p>
+                  <w:pPr>
+                    <w:spacing w:after="0" w:before="0" w:line="212"/>
+                  </w:pPr>
+                  <w:r>
+                    <w:rPr>
+                      <w:rFonts w:ascii="Calibri" w:cs="Calibri" w:eastAsia="Calibri" w:hAnsi="Calibri"/>
+                      <w:sz w:val="14"/>
+                      <w:szCs w:val="14"/>
+                    </w:rPr>
+                    <w:t xml:space="preserve">Any</w:t>
+                  </w:r>
+                </w:p>
+              </w:tc>
+              <w:tc>
+                <w:tcPr>
+                  <w:tcW w:type="dxa" w:w="1396"/>
+                  <w:tcBorders>
+                    <w:top w:val="single" w:color="C9D5D8" w:sz="2"/>
+                    <w:left w:val="single" w:color="C9D5D8" w:sz="2"/>
+                    <w:bottom w:val="single" w:color="C9D5D8" w:sz="2"/>
+                    <w:right w:val="single" w:color="C9D5D8" w:sz="2"/>
+                  </w:tcBorders>
+                  <w:tcMar>
+                    <w:top w:type="dxa" w:w="8"/>
+                    <w:left w:type="dxa" w:w="46"/>
+                    <w:bottom w:type="dxa" w:w="8"/>
+                    <w:right w:type="dxa" w:w="36"/>
+                  </w:tcMar>
+                  <w:vAlign w:val="center"/>
+                </w:tcPr>
+                <w:p>
+                  <w:pPr>
+                    <w:spacing w:after="0" w:before="0" w:line="212"/>
+                  </w:pPr>
+                  <w:r>
+                    <w:rPr>
+                      <w:rFonts w:ascii="Consolas" w:cs="Consolas" w:eastAsia="Consolas" w:hAnsi="Consolas"/>
+                      <w:color w:val="1F1F1F"/>
+                      <w:sz w:val="13"/>
+                      <w:szCs w:val="13"/>
+                    </w:rPr>
+                    <w:t xml:space="preserve">migration-assessment</w:t>
+                  </w:r>
+                  <w:r>
+                    <w:rPr>
+                      <w:rFonts w:ascii="Calibri" w:cs="Calibri" w:eastAsia="Calibri" w:hAnsi="Calibri"/>
+                      <w:sz w:val="14"/>
+                      <w:szCs w:val="14"/>
+                    </w:rPr>
+                    <w:t xml:space="preserve"> (front door)</w:t>
+                  </w:r>
+                </w:p>
+              </w:tc>
+              <w:tc>
+                <w:tcPr>
+                  <w:tcW w:type="dxa" w:w="1396"/>
+                  <w:tcBorders>
+                    <w:top w:val="single" w:color="C9D5D8" w:sz="2"/>
+                    <w:left w:val="single" w:color="C9D5D8" w:sz="2"/>
+                    <w:bottom w:val="single" w:color="C9D5D8" w:sz="2"/>
+                    <w:right w:val="single" w:color="C9D5D8" w:sz="2"/>
+                  </w:tcBorders>
+                  <w:tcMar>
+                    <w:top w:type="dxa" w:w="8"/>
+                    <w:left w:type="dxa" w:w="46"/>
+                    <w:bottom w:type="dxa" w:w="8"/>
+                    <w:right w:type="dxa" w:w="36"/>
+                  </w:tcMar>
+                  <w:vAlign w:val="center"/>
+                </w:tcPr>
+                <w:p>
+                  <w:pPr>
+                    <w:spacing w:after="0" w:before="0" w:line="212"/>
+                  </w:pPr>
+                  <w:r>
+                    <w:rPr>
+                      <w:rFonts w:ascii="Consolas" w:cs="Consolas" w:eastAsia="Consolas" w:hAnsi="Consolas"/>
+                      <w:color w:val="1F1F1F"/>
+                      <w:sz w:val="13"/>
+                      <w:szCs w:val="13"/>
+                    </w:rPr>
+                    <w:t xml:space="preserve">schema-conformance</w:t>
+                  </w:r>
+                  <w:r>
+                    <w:rPr>
+                      <w:rFonts w:ascii="Calibri" w:cs="Calibri" w:eastAsia="Calibri" w:hAnsi="Calibri"/>
+                      <w:sz w:val="14"/>
+                      <w:szCs w:val="14"/>
+                    </w:rPr>
+                    <w:t xml:space="preserve"> · </w:t>
+                  </w:r>
+                  <w:r>
+                    <w:rPr>
+                      <w:rFonts w:ascii="Consolas" w:cs="Consolas" w:eastAsia="Consolas" w:hAnsi="Consolas"/>
+                      <w:color w:val="1F1F1F"/>
+                      <w:sz w:val="13"/>
+                      <w:szCs w:val="13"/>
+                    </w:rPr>
+                    <w:t xml:space="preserve">schema-change-propagation</w:t>
+                  </w:r>
+                </w:p>
+              </w:tc>
+              <w:tc>
+                <w:tcPr>
+                  <w:tcW w:type="dxa" w:w="1344"/>
+                  <w:tcBorders>
+                    <w:top w:val="single" w:color="C9D5D8" w:sz="2"/>
+                    <w:left w:val="single" w:color="C9D5D8" w:sz="2"/>
+                    <w:bottom w:val="single" w:color="C9D5D8" w:sz="2"/>
+                    <w:right w:val="single" w:color="C9D5D8" w:sz="2"/>
+                  </w:tcBorders>
+                  <w:tcMar>
+                    <w:top w:type="dxa" w:w="8"/>
+                    <w:left w:type="dxa" w:w="46"/>
+                    <w:bottom w:type="dxa" w:w="8"/>
+                    <w:right w:type="dxa" w:w="36"/>
+                  </w:tcMar>
+                  <w:vAlign w:val="center"/>
+                </w:tcPr>
+                <w:p>
+                  <w:pPr>
+                    <w:spacing w:after="0" w:before="0" w:line="212"/>
+                  </w:pPr>
+                  <w:r>
+                    <w:rPr>
+                      <w:rFonts w:ascii="Calibri" w:cs="Calibri" w:eastAsia="Calibri" w:hAnsi="Calibri"/>
+                      <w:sz w:val="14"/>
+                      <w:szCs w:val="14"/>
+                    </w:rPr>
+                    <w:t xml:space="preserve">agents: migration (1 + 3) · reporting (2)</w:t>
+                  </w:r>
+                </w:p>
+              </w:tc>
+            </w:tr>
+          </w:tbl>
+          <w:p>
+            <w:pPr>
+              <w:keepNext/>
+              <w:pBdr>
+                <w:bottom w:val="single" w:color="1F7A8C" w:sz="6" w:space="1"/>
+              </w:pBdr>
+              <w:spacing w:after="26" w:before="60"/>
+            </w:pPr>
+            <w:r>
+              <w:rPr>
+                <w:rFonts w:ascii="Calibri" w:cs="Calibri" w:eastAsia="Calibri" w:hAnsi="Calibri"/>
+                <w:b/>
+                <w:bCs/>
+                <w:color w:val="0B2E3A"/>
+                <w:sz w:val="18"/>
+                <w:szCs w:val="18"/>
+              </w:rPr>
               <w:t xml:space="preserve">Steering (always in context)</w:t>
             </w:r>
           </w:p>
@@ -3830,6 +4617,175 @@
                 <w:sz w:val="18"/>
                 <w:szCs w:val="18"/>
               </w:rPr>
+              <w:t xml:space="preserve">Run and test from Kiro</w:t>
+            </w:r>
+          </w:p>
+          <w:p>
+            <w:pPr>
+              <w:spacing w:after="10" w:before="0" w:line="224"/>
+            </w:pPr>
+            <w:r>
+              <w:rPr>
+                <w:rFonts w:ascii="Calibri" w:cs="Calibri" w:eastAsia="Calibri" w:hAnsi="Calibri"/>
+                <w:sz w:val="14"/>
+                <w:szCs w:val="14"/>
+              </w:rPr>
+              <w:t xml:space="preserve">1 open the trusted project · 2 </w:t>
+            </w:r>
+            <w:r>
+              <w:rPr>
+                <w:rFonts w:ascii="Consolas" w:cs="Consolas" w:eastAsia="Consolas" w:hAnsi="Consolas"/>
+                <w:color w:val="1F1F1F"/>
+                <w:sz w:val="13"/>
+                <w:szCs w:val="13"/>
+              </w:rPr>
+              <w:t xml:space="preserve">run_tests.sh --skill</w:t>
+            </w:r>
+            <w:r>
+              <w:rPr>
+                <w:rFonts w:ascii="Calibri" w:cs="Calibri" w:eastAsia="Calibri" w:hAnsi="Calibri"/>
+                <w:sz w:val="14"/>
+                <w:szCs w:val="14"/>
+              </w:rPr>
+              <w:t xml:space="preserve"> → RESULT: PASS · 3 </w:t>
+            </w:r>
+            <w:r>
+              <w:rPr>
+                <w:rFonts w:ascii="Consolas" w:cs="Consolas" w:eastAsia="Consolas" w:hAnsi="Consolas"/>
+                <w:color w:val="1F1F1F"/>
+                <w:sz w:val="13"/>
+                <w:szCs w:val="13"/>
+              </w:rPr>
+              <w:t xml:space="preserve">verify_agents.sh</w:t>
+            </w:r>
+            <w:r>
+              <w:rPr>
+                <w:rFonts w:ascii="Calibri" w:cs="Calibri" w:eastAsia="Calibri" w:hAnsi="Calibri"/>
+                <w:sz w:val="14"/>
+                <w:szCs w:val="14"/>
+              </w:rPr>
+              <w:t xml:space="preserve"> → AGENTS: PASS · 4 </w:t>
+            </w:r>
+            <w:r>
+              <w:rPr>
+                <w:rFonts w:ascii="Consolas" w:cs="Consolas" w:eastAsia="Consolas" w:hAnsi="Consolas"/>
+                <w:color w:val="1F1F1F"/>
+                <w:sz w:val="13"/>
+                <w:szCs w:val="13"/>
+              </w:rPr>
+              <w:t xml:space="preserve">kiro-cli chat --agent sql-migration-agent</w:t>
+            </w:r>
+            <w:r>
+              <w:rPr>
+                <w:rFonts w:ascii="Calibri" w:cs="Calibri" w:eastAsia="Calibri" w:hAnsi="Calibri"/>
+                <w:sz w:val="14"/>
+                <w:szCs w:val="14"/>
+              </w:rPr>
+              <w:t xml:space="preserve"> | </w:t>
+            </w:r>
+            <w:r>
+              <w:rPr>
+                <w:rFonts w:ascii="Consolas" w:cs="Consolas" w:eastAsia="Consolas" w:hAnsi="Consolas"/>
+                <w:color w:val="1F1F1F"/>
+                <w:sz w:val="13"/>
+                <w:szCs w:val="13"/>
+              </w:rPr>
+              <w:t xml:space="preserve">sql-reporting-agent</w:t>
+            </w:r>
+            <w:r>
+              <w:rPr>
+                <w:rFonts w:ascii="Calibri" w:cs="Calibri" w:eastAsia="Calibri" w:hAnsi="Calibri"/>
+                <w:sz w:val="14"/>
+                <w:szCs w:val="14"/>
+              </w:rPr>
+              <w:t xml:space="preserve"> (IDE: agent selector; </w:t>
+            </w:r>
+            <w:r>
+              <w:rPr>
+                <w:rFonts w:ascii="Consolas" w:cs="Consolas" w:eastAsia="Consolas" w:hAnsi="Consolas"/>
+                <w:color w:val="1F1F1F"/>
+                <w:sz w:val="13"/>
+                <w:szCs w:val="13"/>
+              </w:rPr>
+              <w:t xml:space="preserve">/context show</w:t>
+            </w:r>
+            <w:r>
+              <w:rPr>
+                <w:rFonts w:ascii="Calibri" w:cs="Calibri" w:eastAsia="Calibri" w:hAnsi="Calibri"/>
+                <w:sz w:val="14"/>
+                <w:szCs w:val="14"/>
+              </w:rPr>
+              <w:t xml:space="preserve">) · 5 </w:t>
+            </w:r>
+            <w:r>
+              <w:rPr>
+                <w:rFonts w:ascii="Consolas" w:cs="Consolas" w:eastAsia="Consolas" w:hAnsi="Consolas"/>
+                <w:color w:val="1F1F1F"/>
+                <w:sz w:val="13"/>
+                <w:szCs w:val="13"/>
+              </w:rPr>
+              <w:t xml:space="preserve">/skill-name …</w:t>
+            </w:r>
+            <w:r>
+              <w:rPr>
+                <w:rFonts w:ascii="Calibri" w:cs="Calibri" w:eastAsia="Calibri" w:hAnsi="Calibri"/>
+                <w:sz w:val="14"/>
+                <w:szCs w:val="14"/>
+              </w:rPr>
+              <w:t xml:space="preserve"> to bypass routing · 6 </w:t>
+            </w:r>
+            <w:r>
+              <w:rPr>
+                <w:rFonts w:ascii="Consolas" w:cs="Consolas" w:eastAsia="Consolas" w:hAnsi="Consolas"/>
+                <w:color w:val="1F1F1F"/>
+                <w:sz w:val="13"/>
+                <w:szCs w:val="13"/>
+              </w:rPr>
+              <w:t xml:space="preserve">audit.py tail --run &lt;run8&gt;</w:t>
+            </w:r>
+            <w:r>
+              <w:rPr>
+                <w:rFonts w:ascii="Calibri" w:cs="Calibri" w:eastAsia="Calibri" w:hAnsi="Calibri"/>
+                <w:sz w:val="14"/>
+                <w:szCs w:val="14"/>
+              </w:rPr>
+              <w:t xml:space="preserve"> for the evidence · 7 headless: </w:t>
+            </w:r>
+            <w:r>
+              <w:rPr>
+                <w:rFonts w:ascii="Consolas" w:cs="Consolas" w:eastAsia="Consolas" w:hAnsi="Consolas"/>
+                <w:color w:val="1F1F1F"/>
+                <w:sz w:val="13"/>
+                <w:szCs w:val="13"/>
+              </w:rPr>
+              <w:t xml:space="preserve">kiro-cli chat --no-interactive --agent &lt;agent&gt; "&lt;prompt&gt;"</w:t>
+            </w:r>
+            <w:r>
+              <w:rPr>
+                <w:rFonts w:ascii="Calibri" w:cs="Calibri" w:eastAsia="Calibri" w:hAnsi="Calibri"/>
+                <w:sz w:val="14"/>
+                <w:szCs w:val="14"/>
+              </w:rPr>
+              <w:t xml:space="preserve">.</w:t>
+            </w:r>
+          </w:p>
+          <w:p>
+            <w:pPr>
+              <w:keepNext/>
+              <w:pBdr>
+                <w:bottom w:val="single" w:color="1F7A8C" w:sz="6" w:space="1"/>
+              </w:pBdr>
+              <w:spacing w:after="26" w:before="60"/>
+            </w:pPr>
+            <w:r>
+              <w:rPr>
+                <w:rFonts w:ascii="Calibri" w:cs="Calibri" w:eastAsia="Calibri" w:hAnsi="Calibri"/>
+                <w:b/>
+                <w:bCs/>
+                <w:color w:val="0B2E3A"/>
+                <w:sz w:val="18"/>
+                <w:szCs w:val="18"/>
+              </w:rPr>
               <w:t xml:space="preserve">In Kiro chat</w:t>
             </w:r>
           </w:p>
@@ -4180,71 +5136,6 @@
                       <w:szCs w:val="14"/>
                     </w:rPr>
                     <w:t xml:space="preserve"> with decisions</w:t>
-                  </w:r>
-                </w:p>
-              </w:tc>
-            </w:tr>
-            <w:tr>
-              <w:tc>
-                <w:tcPr>
-                  <w:tcW w:type="dxa" w:w="2586"/>
-                  <w:tcBorders>
-                    <w:top w:val="single" w:color="C9D5D8" w:sz="2"/>
-                    <w:left w:val="single" w:color="C9D5D8" w:sz="2"/>
-                    <w:bottom w:val="single" w:color="C9D5D8" w:sz="2"/>
-                    <w:right w:val="single" w:color="C9D5D8" w:sz="2"/>
-                  </w:tcBorders>
-                  <w:tcMar>
-                    <w:top w:type="dxa" w:w="8"/>
-                    <w:left w:type="dxa" w:w="46"/>
-                    <w:bottom w:type="dxa" w:w="8"/>
-                    <w:right w:type="dxa" w:w="36"/>
-                  </w:tcMar>
-                  <w:vAlign w:val="center"/>
-                </w:tcPr>
-                <w:p>
-                  <w:pPr>
-                    <w:spacing w:after="0" w:before="0" w:line="212"/>
-                  </w:pPr>
-                  <w:r>
-                    <w:rPr>
-                      <w:rFonts w:ascii="Consolas" w:cs="Consolas" w:eastAsia="Consolas" w:hAnsi="Consolas"/>
-                      <w:color w:val="1F1F1F"/>
-                      <w:sz w:val="13"/>
-                      <w:szCs w:val="13"/>
-                    </w:rPr>
-                    <w:t xml:space="preserve">Apply metadata/changes/q3.csv to generated/ as a dry run</w:t>
-                  </w:r>
-                </w:p>
-              </w:tc>
-              <w:tc>
-                <w:tcPr>
-                  <w:tcW w:type="dxa" w:w="2586"/>
-                  <w:tcBorders>
-                    <w:top w:val="single" w:color="C9D5D8" w:sz="2"/>
-                    <w:left w:val="single" w:color="C9D5D8" w:sz="2"/>
-                    <w:bottom w:val="single" w:color="C9D5D8" w:sz="2"/>
-                    <w:right w:val="single" w:color="C9D5D8" w:sz="2"/>
-                  </w:tcBorders>
-                  <w:tcMar>
-                    <w:top w:type="dxa" w:w="8"/>
-                    <w:left w:type="dxa" w:w="46"/>
-                    <w:bottom w:type="dxa" w:w="8"/>
-                    <w:right w:type="dxa" w:w="36"/>
-                  </w:tcMar>
-                  <w:vAlign w:val="center"/>
-                </w:tcPr>
-                <w:p>
-                  <w:pPr>
-                    <w:spacing w:after="0" w:before="0" w:line="212"/>
-                  </w:pPr>
-                  <w:r>
-                    <w:rPr>
-                      <w:rFonts w:ascii="Calibri" w:cs="Calibri" w:eastAsia="Calibri" w:hAnsi="Calibri"/>
-                      <w:sz w:val="14"/>
-                      <w:szCs w:val="14"/>
-                    </w:rPr>
-                    <w:t xml:space="preserve">plan, diff, migration + rollback</w:t>
                   </w:r>
                 </w:p>
               </w:tc>

</xml_diff>